<commit_message>
docs: update executive summary and AI autonomy deck
</commit_message>
<xml_diff>
--- a/projects/top-down-racer-02/docs/summary/00-Executive-Summary.docx
+++ b/projects/top-down-racer-02/docs/summary/00-Executive-Summary.docx
@@ -39,7 +39,7 @@
           <w:sz w:val="28"/>
           <w:szCs w:val="28"/>
         </w:rPr>
-        <w:t xml:space="preserve">Autonomous Development Evidence Package</w:t>
+        <w:t xml:space="preserve">Best-in-Class AI SDLC Evidence Package</w:t>
       </w:r>
     </w:p>
     <w:p>
@@ -96,7 +96,7 @@
           <w:sz w:val="24"/>
           <w:szCs w:val="24"/>
         </w:rPr>
-        <w:t xml:space="preserve">built entirely by autonomous AI development</w:t>
+        <w:t xml:space="preserve">built entirely through best-in-class autonomous AI SDLC</w:t>
       </w:r>
     </w:p>
     <w:p>
@@ -180,16 +180,7 @@
           <w:sz w:val="22"/>
           <w:szCs w:val="22"/>
         </w:rPr>
-        <w:t xml:space="preserve">Can a non-coding architect design, build, and ship a complete software product using autonomous AI development</w:t>
-      </w:r>
-      <w:r>
-        <w:rPr>
-          <w:rFonts w:ascii="Arial" w:cs="Arial" w:eastAsia="Arial" w:hAnsi="Arial"/>
-          <w:color w:val="2C3E50"/>
-          <w:sz w:val="22"/>
-          <w:szCs w:val="22"/>
-        </w:rPr>
-        <w:t xml:space="preserve">—without writing a single line of game code?</w:t>
+        <w:t>Can a non-coding architect design, build, and ship a complete software product using autonomous AI SDLC—with best-in-class rigor—without writing a single line of game code?</w:t>
       </w:r>
     </w:p>
     <w:p>
@@ -217,7 +208,7 @@
           <w:sz w:val="22"/>
           <w:szCs w:val="22"/>
         </w:rPr>
-        <w:t xml:space="preserve">This document is the executive summary of a comprehensive evidence package proving the rigor, quality, and reproducibility of the autonomous development approach. The accompanying technical binders provide the receipts.</w:t>
+        <w:t xml:space="preserve">This document is the executive summary of a 7-document evidence package proving best-in-class SDLC rigor across the full lifecycle—specification, architecture, testing, defect prevention, and process. Most teams don’t produce documentation this thorough. The accompanying technical binders provide the receipts.</w:t>
       </w:r>
     </w:p>
     <w:p>
@@ -714,7 +705,7 @@
                 <w:sz w:val="22"/>
                 <w:szCs w:val="22"/>
               </w:rPr>
-              <w:t xml:space="preserve">80+</w:t>
+              <w:t xml:space="preserve">189+</w:t>
             </w:r>
           </w:p>
         </w:tc>
@@ -783,7 +774,7 @@
                 <w:sz w:val="22"/>
                 <w:szCs w:val="22"/>
               </w:rPr>
-              <w:t xml:space="preserve">366+</w:t>
+              <w:t xml:space="preserve">389</w:t>
             </w:r>
           </w:p>
         </w:tc>
@@ -1328,6 +1319,75 @@
           </w:p>
         </w:tc>
       </w:tr>
+      <w:tr>
+        <w:tc>
+          <w:tcPr>
+            <w:tcW w:type="dxa" w:w="5600"/>
+            <w:tcBorders>
+              <w:top w:val="single" w:color="BDC3C7" w:sz="1"/>
+              <w:left w:val="single" w:color="BDC3C7" w:sz="1"/>
+              <w:bottom w:val="single" w:color="BDC3C7" w:sz="1"/>
+              <w:right w:val="single" w:color="BDC3C7" w:sz="1"/>
+            </w:tcBorders>
+            <w:shd w:fill="D6EAF8" w:val="clear"/>
+            <w:tcMar>
+              <w:top w:type="dxa" w:w="80"/>
+              <w:left w:type="dxa" w:w="120"/>
+              <w:bottom w:type="dxa" w:w="80"/>
+              <w:right w:type="dxa" w:w="120"/>
+            </w:tcMar>
+          </w:tcPr>
+          <w:p>
+            <w:pPr>
+              <w:spacing w:after="0"/>
+            </w:pPr>
+            <w:r>
+              <w:rPr>
+                <w:rFonts w:ascii="Arial" w:cs="Arial" w:eastAsia="Arial" w:hAnsi="Arial"/>
+                <w:color w:val="2C3E50"/>
+                <w:sz w:val="22"/>
+                <w:szCs w:val="22"/>
+              </w:rPr>
+              <w:t xml:space="preserve">Total lines of code</w:t>
+            </w:r>
+          </w:p>
+        </w:tc>
+        <w:tc>
+          <w:tcPr>
+            <w:tcW w:type="dxa" w:w="3760"/>
+            <w:tcBorders>
+              <w:top w:val="single" w:color="BDC3C7" w:sz="1"/>
+              <w:left w:val="single" w:color="BDC3C7" w:sz="1"/>
+              <w:bottom w:val="single" w:color="BDC3C7" w:sz="1"/>
+              <w:right w:val="single" w:color="BDC3C7" w:sz="1"/>
+            </w:tcBorders>
+            <w:shd w:fill="D6EAF8" w:val="clear"/>
+            <w:tcMar>
+              <w:top w:type="dxa" w:w="80"/>
+              <w:left w:type="dxa" w:w="120"/>
+              <w:bottom w:type="dxa" w:w="80"/>
+              <w:right w:type="dxa" w:w="120"/>
+            </w:tcMar>
+          </w:tcPr>
+          <w:p>
+            <w:pPr>
+              <w:spacing w:after="0"/>
+              <w:jc w:val="right"/>
+            </w:pPr>
+            <w:r>
+              <w:rPr>
+                <w:rFonts w:ascii="Arial" w:cs="Arial" w:eastAsia="Arial" w:hAnsi="Arial"/>
+                <w:b/>
+                <w:bCs/>
+                <w:color w:val="2C3E50"/>
+                <w:sz w:val="22"/>
+                <w:szCs w:val="22"/>
+              </w:rPr>
+              <w:t xml:space="preserve">10,497</w:t>
+            </w:r>
+          </w:p>
+        </w:tc>
+      </w:tr>
     </w:tbl>
     <w:p>
       <w:pPr>
@@ -1386,7 +1446,7 @@
         <w:pStyle w:val="Heading2"/>
       </w:pPr>
       <w:r>
-        <w:t xml:space="preserve">The Autonomous Development Stack</w:t>
+        <w:t xml:space="preserve">The Autonomous SDLC Stack</w:t>
       </w:r>
     </w:p>
     <w:p>
@@ -1445,7 +1505,7 @@
           <w:sz w:val="22"/>
           <w:szCs w:val="22"/>
         </w:rPr>
-        <w:t xml:space="preserve"> that has a clean 200K token context window. Task 50 runs at the same quality level as Task 1. Every task produces an atomic git commit. If something breaks, you can bisect to the exact task that caused it.</w:t>
+        <w:t xml:space="preserve"> that has a clean 200K token context window. Task 189 runs at the same quality level as Task 1. Every task produces an atomic git commit. If something breaks, you can bisect to the exact task that caused it.</w:t>
       </w:r>
     </w:p>
     <w:p>
@@ -2603,1136 +2663,97 @@
     </w:p>
     <w:p>
       <w:pPr>
-        <w:pStyle w:val="Heading3"/>
-      </w:pPr>
-      <w:r>
-        <w:t xml:space="preserve">Sample Bugs Caught Before Execution</w:t>
-      </w:r>
-    </w:p>
-    <w:tbl>
-      <w:tblPr>
-        <w:tblW w:type="dxa" w:w="9360"/>
-        <w:tblBorders>
-          <w:top w:val="single" w:color="auto" w:sz="4"/>
-          <w:left w:val="single" w:color="auto" w:sz="4"/>
-          <w:bottom w:val="single" w:color="auto" w:sz="4"/>
-          <w:right w:val="single" w:color="auto" w:sz="4"/>
-          <w:insideH w:val="single" w:color="auto" w:sz="4"/>
-          <w:insideV w:val="single" w:color="auto" w:sz="4"/>
-        </w:tblBorders>
-      </w:tblPr>
-      <w:tblGrid>
-        <w:gridCol w:w="3100"/>
-        <w:gridCol w:w="1800"/>
-        <w:gridCol w:w="4460"/>
-      </w:tblGrid>
-      <w:tr>
-        <w:tc>
-          <w:tcPr>
-            <w:tcW w:type="dxa" w:w="3100"/>
-            <w:tcBorders>
-              <w:top w:val="single" w:color="BDC3C7" w:sz="1"/>
-              <w:left w:val="single" w:color="BDC3C7" w:sz="1"/>
-              <w:bottom w:val="single" w:color="BDC3C7" w:sz="1"/>
-              <w:right w:val="single" w:color="BDC3C7" w:sz="1"/>
-            </w:tcBorders>
-            <w:shd w:fill="1B4F72" w:val="clear"/>
-            <w:tcMar>
-              <w:top w:type="dxa" w:w="80"/>
-              <w:left w:type="dxa" w:w="120"/>
-              <w:bottom w:type="dxa" w:w="80"/>
-              <w:right w:type="dxa" w:w="120"/>
-            </w:tcMar>
-          </w:tcPr>
-          <w:p>
-            <w:pPr>
-              <w:spacing w:after="0"/>
-              <w:jc w:val="left"/>
-            </w:pPr>
-            <w:r>
-              <w:rPr>
-                <w:rFonts w:ascii="Arial" w:cs="Arial" w:eastAsia="Arial" w:hAnsi="Arial"/>
-                <w:b/>
-                <w:bCs/>
-                <w:color w:val="FFFFFF"/>
-                <w:sz w:val="20"/>
-                <w:szCs w:val="20"/>
-              </w:rPr>
-              <w:t xml:space="preserve">Bug</w:t>
-            </w:r>
-          </w:p>
-        </w:tc>
-        <w:tc>
-          <w:tcPr>
-            <w:tcW w:type="dxa" w:w="1800"/>
-            <w:tcBorders>
-              <w:top w:val="single" w:color="BDC3C7" w:sz="1"/>
-              <w:left w:val="single" w:color="BDC3C7" w:sz="1"/>
-              <w:bottom w:val="single" w:color="BDC3C7" w:sz="1"/>
-              <w:right w:val="single" w:color="BDC3C7" w:sz="1"/>
-            </w:tcBorders>
-            <w:shd w:fill="1B4F72" w:val="clear"/>
-            <w:tcMar>
-              <w:top w:type="dxa" w:w="80"/>
-              <w:left w:type="dxa" w:w="120"/>
-              <w:bottom w:type="dxa" w:w="80"/>
-              <w:right w:type="dxa" w:w="120"/>
-            </w:tcMar>
-          </w:tcPr>
-          <w:p>
-            <w:pPr>
-              <w:spacing w:after="0"/>
-              <w:jc w:val="center"/>
-            </w:pPr>
-            <w:r>
-              <w:rPr>
-                <w:rFonts w:ascii="Arial" w:cs="Arial" w:eastAsia="Arial" w:hAnsi="Arial"/>
-                <w:b/>
-                <w:bCs/>
-                <w:color w:val="FFFFFF"/>
-                <w:sz w:val="20"/>
-                <w:szCs w:val="20"/>
-              </w:rPr>
-              <w:t xml:space="preserve">Severity</w:t>
-            </w:r>
-          </w:p>
-        </w:tc>
-        <w:tc>
-          <w:tcPr>
-            <w:tcW w:type="dxa" w:w="4460"/>
-            <w:tcBorders>
-              <w:top w:val="single" w:color="BDC3C7" w:sz="1"/>
-              <w:left w:val="single" w:color="BDC3C7" w:sz="1"/>
-              <w:bottom w:val="single" w:color="BDC3C7" w:sz="1"/>
-              <w:right w:val="single" w:color="BDC3C7" w:sz="1"/>
-            </w:tcBorders>
-            <w:shd w:fill="1B4F72" w:val="clear"/>
-            <w:tcMar>
-              <w:top w:type="dxa" w:w="80"/>
-              <w:left w:type="dxa" w:w="120"/>
-              <w:bottom w:type="dxa" w:w="80"/>
-              <w:right w:type="dxa" w:w="120"/>
-            </w:tcMar>
-          </w:tcPr>
-          <w:p>
-            <w:pPr>
-              <w:spacing w:after="0"/>
-              <w:jc w:val="center"/>
-            </w:pPr>
-            <w:r>
-              <w:rPr>
-                <w:rFonts w:ascii="Arial" w:cs="Arial" w:eastAsia="Arial" w:hAnsi="Arial"/>
-                <w:b/>
-                <w:bCs/>
-                <w:color w:val="FFFFFF"/>
-                <w:sz w:val="20"/>
-                <w:szCs w:val="20"/>
-              </w:rPr>
-              <w:t xml:space="preserve">What Would Have Happened</w:t>
-            </w:r>
-          </w:p>
-        </w:tc>
-      </w:tr>
-      <w:tr>
-        <w:tc>
-          <w:tcPr>
-            <w:tcW w:type="dxa" w:w="3100"/>
-            <w:tcBorders>
-              <w:top w:val="single" w:color="BDC3C7" w:sz="1"/>
-              <w:left w:val="single" w:color="BDC3C7" w:sz="1"/>
-              <w:bottom w:val="single" w:color="BDC3C7" w:sz="1"/>
-              <w:right w:val="single" w:color="BDC3C7" w:sz="1"/>
-            </w:tcBorders>
-            <w:tcMar>
-              <w:top w:type="dxa" w:w="80"/>
-              <w:left w:type="dxa" w:w="120"/>
-              <w:bottom w:type="dxa" w:w="80"/>
-              <w:right w:type="dxa" w:w="120"/>
-            </w:tcMar>
-          </w:tcPr>
-          <w:p>
-            <w:pPr>
-              <w:spacing w:after="0"/>
-              <w:jc w:val="left"/>
-            </w:pPr>
-            <w:r>
-              <w:rPr>
-                <w:rFonts w:ascii="Arial" w:cs="Arial" w:eastAsia="Arial" w:hAnsi="Arial"/>
-                <w:color w:val="2C3E50"/>
-                <w:sz w:val="20"/>
-                <w:szCs w:val="20"/>
-              </w:rPr>
-              <w:t xml:space="preserve">Sparse reward instead of dense</w:t>
-            </w:r>
-          </w:p>
-        </w:tc>
-        <w:tc>
-          <w:tcPr>
-            <w:tcW w:type="dxa" w:w="1800"/>
-            <w:tcBorders>
-              <w:top w:val="single" w:color="BDC3C7" w:sz="1"/>
-              <w:left w:val="single" w:color="BDC3C7" w:sz="1"/>
-              <w:bottom w:val="single" w:color="BDC3C7" w:sz="1"/>
-              <w:right w:val="single" w:color="BDC3C7" w:sz="1"/>
-            </w:tcBorders>
-            <w:tcMar>
-              <w:top w:type="dxa" w:w="80"/>
-              <w:left w:type="dxa" w:w="120"/>
-              <w:bottom w:type="dxa" w:w="80"/>
-              <w:right w:type="dxa" w:w="120"/>
-            </w:tcMar>
-          </w:tcPr>
-          <w:p>
-            <w:pPr>
-              <w:spacing w:after="0"/>
-              <w:jc w:val="center"/>
-            </w:pPr>
-            <w:r>
-              <w:rPr>
-                <w:rFonts w:ascii="Arial" w:cs="Arial" w:eastAsia="Arial" w:hAnsi="Arial"/>
-                <w:color w:val="2C3E50"/>
-                <w:sz w:val="20"/>
-                <w:szCs w:val="20"/>
-              </w:rPr>
-              <w:t xml:space="preserve">Critical</w:t>
-            </w:r>
-          </w:p>
-        </w:tc>
-        <w:tc>
-          <w:tcPr>
-            <w:tcW w:type="dxa" w:w="4460"/>
-            <w:tcBorders>
-              <w:top w:val="single" w:color="BDC3C7" w:sz="1"/>
-              <w:left w:val="single" w:color="BDC3C7" w:sz="1"/>
-              <w:bottom w:val="single" w:color="BDC3C7" w:sz="1"/>
-              <w:right w:val="single" w:color="BDC3C7" w:sz="1"/>
-            </w:tcBorders>
-            <w:tcMar>
-              <w:top w:type="dxa" w:w="80"/>
-              <w:left w:type="dxa" w:w="120"/>
-              <w:bottom w:type="dxa" w:w="80"/>
-              <w:right w:type="dxa" w:w="120"/>
-            </w:tcMar>
-          </w:tcPr>
-          <w:p>
-            <w:pPr>
-              <w:spacing w:after="0"/>
-              <w:jc w:val="center"/>
-            </w:pPr>
-            <w:r>
-              <w:rPr>
-                <w:rFonts w:ascii="Arial" w:cs="Arial" w:eastAsia="Arial" w:hAnsi="Arial"/>
-                <w:color w:val="2C3E50"/>
-                <w:sz w:val="20"/>
-                <w:szCs w:val="20"/>
-              </w:rPr>
-              <w:t xml:space="preserve">AI training would have failed completely—no learning signal</w:t>
-            </w:r>
-          </w:p>
-        </w:tc>
-      </w:tr>
-      <w:tr>
-        <w:tc>
-          <w:tcPr>
-            <w:tcW w:type="dxa" w:w="3100"/>
-            <w:tcBorders>
-              <w:top w:val="single" w:color="BDC3C7" w:sz="1"/>
-              <w:left w:val="single" w:color="BDC3C7" w:sz="1"/>
-              <w:bottom w:val="single" w:color="BDC3C7" w:sz="1"/>
-              <w:right w:val="single" w:color="BDC3C7" w:sz="1"/>
-            </w:tcBorders>
-            <w:shd w:fill="F2F3F4" w:val="clear"/>
-            <w:tcMar>
-              <w:top w:type="dxa" w:w="80"/>
-              <w:left w:type="dxa" w:w="120"/>
-              <w:bottom w:type="dxa" w:w="80"/>
-              <w:right w:type="dxa" w:w="120"/>
-            </w:tcMar>
-          </w:tcPr>
-          <w:p>
-            <w:pPr>
-              <w:spacing w:after="0"/>
-              <w:jc w:val="left"/>
-            </w:pPr>
-            <w:r>
-              <w:rPr>
-                <w:rFonts w:ascii="Arial" w:cs="Arial" w:eastAsia="Arial" w:hAnsi="Arial"/>
-                <w:color w:val="2C3E50"/>
-                <w:sz w:val="20"/>
-                <w:szCs w:val="20"/>
-              </w:rPr>
-              <w:t xml:space="preserve">Speed bonus 37x too high</w:t>
-            </w:r>
-          </w:p>
-        </w:tc>
-        <w:tc>
-          <w:tcPr>
-            <w:tcW w:type="dxa" w:w="1800"/>
-            <w:tcBorders>
-              <w:top w:val="single" w:color="BDC3C7" w:sz="1"/>
-              <w:left w:val="single" w:color="BDC3C7" w:sz="1"/>
-              <w:bottom w:val="single" w:color="BDC3C7" w:sz="1"/>
-              <w:right w:val="single" w:color="BDC3C7" w:sz="1"/>
-            </w:tcBorders>
-            <w:shd w:fill="F2F3F4" w:val="clear"/>
-            <w:tcMar>
-              <w:top w:type="dxa" w:w="80"/>
-              <w:left w:type="dxa" w:w="120"/>
-              <w:bottom w:type="dxa" w:w="80"/>
-              <w:right w:type="dxa" w:w="120"/>
-            </w:tcMar>
-          </w:tcPr>
-          <w:p>
-            <w:pPr>
-              <w:spacing w:after="0"/>
-              <w:jc w:val="center"/>
-            </w:pPr>
-            <w:r>
-              <w:rPr>
-                <w:rFonts w:ascii="Arial" w:cs="Arial" w:eastAsia="Arial" w:hAnsi="Arial"/>
-                <w:color w:val="2C3E50"/>
-                <w:sz w:val="20"/>
-                <w:szCs w:val="20"/>
-              </w:rPr>
-              <w:t xml:space="preserve">Critical</w:t>
-            </w:r>
-          </w:p>
-        </w:tc>
-        <w:tc>
-          <w:tcPr>
-            <w:tcW w:type="dxa" w:w="4460"/>
-            <w:tcBorders>
-              <w:top w:val="single" w:color="BDC3C7" w:sz="1"/>
-              <w:left w:val="single" w:color="BDC3C7" w:sz="1"/>
-              <w:bottom w:val="single" w:color="BDC3C7" w:sz="1"/>
-              <w:right w:val="single" w:color="BDC3C7" w:sz="1"/>
-            </w:tcBorders>
-            <w:shd w:fill="F2F3F4" w:val="clear"/>
-            <w:tcMar>
-              <w:top w:type="dxa" w:w="80"/>
-              <w:left w:type="dxa" w:w="120"/>
-              <w:bottom w:type="dxa" w:w="80"/>
-              <w:right w:type="dxa" w:w="120"/>
-            </w:tcMar>
-          </w:tcPr>
-          <w:p>
-            <w:pPr>
-              <w:spacing w:after="0"/>
-              <w:jc w:val="center"/>
-            </w:pPr>
-            <w:r>
-              <w:rPr>
-                <w:rFonts w:ascii="Arial" w:cs="Arial" w:eastAsia="Arial" w:hAnsi="Arial"/>
-                <w:color w:val="2C3E50"/>
-                <w:sz w:val="20"/>
-                <w:szCs w:val="20"/>
-              </w:rPr>
-              <w:t xml:space="preserve">AI learns to spin in circles at max speed instead of racing</w:t>
-            </w:r>
-          </w:p>
-        </w:tc>
-      </w:tr>
-      <w:tr>
-        <w:tc>
-          <w:tcPr>
-            <w:tcW w:type="dxa" w:w="3100"/>
-            <w:tcBorders>
-              <w:top w:val="single" w:color="BDC3C7" w:sz="1"/>
-              <w:left w:val="single" w:color="BDC3C7" w:sz="1"/>
-              <w:bottom w:val="single" w:color="BDC3C7" w:sz="1"/>
-              <w:right w:val="single" w:color="BDC3C7" w:sz="1"/>
-            </w:tcBorders>
-            <w:tcMar>
-              <w:top w:type="dxa" w:w="80"/>
-              <w:left w:type="dxa" w:w="120"/>
-              <w:bottom w:type="dxa" w:w="80"/>
-              <w:right w:type="dxa" w:w="120"/>
-            </w:tcMar>
-          </w:tcPr>
-          <w:p>
-            <w:pPr>
-              <w:spacing w:after="0"/>
-              <w:jc w:val="left"/>
-            </w:pPr>
-            <w:r>
-              <w:rPr>
-                <w:rFonts w:ascii="Arial" w:cs="Arial" w:eastAsia="Arial" w:hAnsi="Arial"/>
-                <w:color w:val="2C3E50"/>
-                <w:sz w:val="20"/>
-                <w:szCs w:val="20"/>
-              </w:rPr>
-              <w:t xml:space="preserve">AI car heading 90° wrong</w:t>
-            </w:r>
-          </w:p>
-        </w:tc>
-        <w:tc>
-          <w:tcPr>
-            <w:tcW w:type="dxa" w:w="1800"/>
-            <w:tcBorders>
-              <w:top w:val="single" w:color="BDC3C7" w:sz="1"/>
-              <w:left w:val="single" w:color="BDC3C7" w:sz="1"/>
-              <w:bottom w:val="single" w:color="BDC3C7" w:sz="1"/>
-              <w:right w:val="single" w:color="BDC3C7" w:sz="1"/>
-            </w:tcBorders>
-            <w:tcMar>
-              <w:top w:type="dxa" w:w="80"/>
-              <w:left w:type="dxa" w:w="120"/>
-              <w:bottom w:type="dxa" w:w="80"/>
-              <w:right w:type="dxa" w:w="120"/>
-            </w:tcMar>
-          </w:tcPr>
-          <w:p>
-            <w:pPr>
-              <w:spacing w:after="0"/>
-              <w:jc w:val="center"/>
-            </w:pPr>
-            <w:r>
-              <w:rPr>
-                <w:rFonts w:ascii="Arial" w:cs="Arial" w:eastAsia="Arial" w:hAnsi="Arial"/>
-                <w:color w:val="2C3E50"/>
-                <w:sz w:val="20"/>
-                <w:szCs w:val="20"/>
-              </w:rPr>
-              <w:t xml:space="preserve">High</w:t>
-            </w:r>
-          </w:p>
-        </w:tc>
-        <w:tc>
-          <w:tcPr>
-            <w:tcW w:type="dxa" w:w="4460"/>
-            <w:tcBorders>
-              <w:top w:val="single" w:color="BDC3C7" w:sz="1"/>
-              <w:left w:val="single" w:color="BDC3C7" w:sz="1"/>
-              <w:bottom w:val="single" w:color="BDC3C7" w:sz="1"/>
-              <w:right w:val="single" w:color="BDC3C7" w:sz="1"/>
-            </w:tcBorders>
-            <w:tcMar>
-              <w:top w:type="dxa" w:w="80"/>
-              <w:left w:type="dxa" w:w="120"/>
-              <w:bottom w:type="dxa" w:w="80"/>
-              <w:right w:type="dxa" w:w="120"/>
-            </w:tcMar>
-          </w:tcPr>
-          <w:p>
-            <w:pPr>
-              <w:spacing w:after="0"/>
-              <w:jc w:val="center"/>
-            </w:pPr>
-            <w:r>
-              <w:rPr>
-                <w:rFonts w:ascii="Arial" w:cs="Arial" w:eastAsia="Arial" w:hAnsi="Arial"/>
-                <w:color w:val="2C3E50"/>
-                <w:sz w:val="20"/>
-                <w:szCs w:val="20"/>
-              </w:rPr>
-              <w:t xml:space="preserve">Ghost car visually drives sideways on screen</w:t>
-            </w:r>
-          </w:p>
-        </w:tc>
-      </w:tr>
-      <w:tr>
-        <w:tc>
-          <w:tcPr>
-            <w:tcW w:type="dxa" w:w="3100"/>
-            <w:tcBorders>
-              <w:top w:val="single" w:color="BDC3C7" w:sz="1"/>
-              <w:left w:val="single" w:color="BDC3C7" w:sz="1"/>
-              <w:bottom w:val="single" w:color="BDC3C7" w:sz="1"/>
-              <w:right w:val="single" w:color="BDC3C7" w:sz="1"/>
-            </w:tcBorders>
-            <w:shd w:fill="F2F3F4" w:val="clear"/>
-            <w:tcMar>
-              <w:top w:type="dxa" w:w="80"/>
-              <w:left w:type="dxa" w:w="120"/>
-              <w:bottom w:type="dxa" w:w="80"/>
-              <w:right w:type="dxa" w:w="120"/>
-            </w:tcMar>
-          </w:tcPr>
-          <w:p>
-            <w:pPr>
-              <w:spacing w:after="0"/>
-              <w:jc w:val="left"/>
-            </w:pPr>
-            <w:r>
-              <w:rPr>
-                <w:rFonts w:ascii="Arial" w:cs="Arial" w:eastAsia="Arial" w:hAnsi="Arial"/>
-                <w:color w:val="2C3E50"/>
-                <w:sz w:val="20"/>
-                <w:szCs w:val="20"/>
-              </w:rPr>
-              <w:t xml:space="preserve">VecNormStats snake/camelCase mismatch</w:t>
-            </w:r>
-          </w:p>
-        </w:tc>
-        <w:tc>
-          <w:tcPr>
-            <w:tcW w:type="dxa" w:w="1800"/>
-            <w:tcBorders>
-              <w:top w:val="single" w:color="BDC3C7" w:sz="1"/>
-              <w:left w:val="single" w:color="BDC3C7" w:sz="1"/>
-              <w:bottom w:val="single" w:color="BDC3C7" w:sz="1"/>
-              <w:right w:val="single" w:color="BDC3C7" w:sz="1"/>
-            </w:tcBorders>
-            <w:shd w:fill="F2F3F4" w:val="clear"/>
-            <w:tcMar>
-              <w:top w:type="dxa" w:w="80"/>
-              <w:left w:type="dxa" w:w="120"/>
-              <w:bottom w:type="dxa" w:w="80"/>
-              <w:right w:type="dxa" w:w="120"/>
-            </w:tcMar>
-          </w:tcPr>
-          <w:p>
-            <w:pPr>
-              <w:spacing w:after="0"/>
-              <w:jc w:val="center"/>
-            </w:pPr>
-            <w:r>
-              <w:rPr>
-                <w:rFonts w:ascii="Arial" w:cs="Arial" w:eastAsia="Arial" w:hAnsi="Arial"/>
-                <w:color w:val="2C3E50"/>
-                <w:sz w:val="20"/>
-                <w:szCs w:val="20"/>
-              </w:rPr>
-              <w:t xml:space="preserve">Critical</w:t>
-            </w:r>
-          </w:p>
-        </w:tc>
-        <w:tc>
-          <w:tcPr>
-            <w:tcW w:type="dxa" w:w="4460"/>
-            <w:tcBorders>
-              <w:top w:val="single" w:color="BDC3C7" w:sz="1"/>
-              <w:left w:val="single" w:color="BDC3C7" w:sz="1"/>
-              <w:bottom w:val="single" w:color="BDC3C7" w:sz="1"/>
-              <w:right w:val="single" w:color="BDC3C7" w:sz="1"/>
-            </w:tcBorders>
-            <w:shd w:fill="F2F3F4" w:val="clear"/>
-            <w:tcMar>
-              <w:top w:type="dxa" w:w="80"/>
-              <w:left w:type="dxa" w:w="120"/>
-              <w:bottom w:type="dxa" w:w="80"/>
-              <w:right w:type="dxa" w:w="120"/>
-            </w:tcMar>
-          </w:tcPr>
-          <w:p>
-            <w:pPr>
-              <w:spacing w:after="0"/>
-              <w:jc w:val="center"/>
-            </w:pPr>
-            <w:r>
-              <w:rPr>
-                <w:rFonts w:ascii="Arial" w:cs="Arial" w:eastAsia="Arial" w:hAnsi="Arial"/>
-                <w:color w:val="2C3E50"/>
-                <w:sz w:val="20"/>
-                <w:szCs w:val="20"/>
-              </w:rPr>
-              <w:t xml:space="preserve">All AI inference produces NaN—AI completely non-functional</w:t>
-            </w:r>
-          </w:p>
-        </w:tc>
-      </w:tr>
-      <w:tr>
-        <w:tc>
-          <w:tcPr>
-            <w:tcW w:type="dxa" w:w="3100"/>
-            <w:tcBorders>
-              <w:top w:val="single" w:color="BDC3C7" w:sz="1"/>
-              <w:left w:val="single" w:color="BDC3C7" w:sz="1"/>
-              <w:bottom w:val="single" w:color="BDC3C7" w:sz="1"/>
-              <w:right w:val="single" w:color="BDC3C7" w:sz="1"/>
-            </w:tcBorders>
-            <w:tcMar>
-              <w:top w:type="dxa" w:w="80"/>
-              <w:left w:type="dxa" w:w="120"/>
-              <w:bottom w:type="dxa" w:w="80"/>
-              <w:right w:type="dxa" w:w="120"/>
-            </w:tcMar>
-          </w:tcPr>
-          <w:p>
-            <w:pPr>
-              <w:spacing w:after="0"/>
-              <w:jc w:val="left"/>
-            </w:pPr>
-            <w:r>
-              <w:rPr>
-                <w:rFonts w:ascii="Arial" w:cs="Arial" w:eastAsia="Arial" w:hAnsi="Arial"/>
-                <w:color w:val="2C3E50"/>
-                <w:sz w:val="20"/>
-                <w:szCs w:val="20"/>
-              </w:rPr>
-              <w:t xml:space="preserve">WASM output tensors not disposed</w:t>
-            </w:r>
-          </w:p>
-        </w:tc>
-        <w:tc>
-          <w:tcPr>
-            <w:tcW w:type="dxa" w:w="1800"/>
-            <w:tcBorders>
-              <w:top w:val="single" w:color="BDC3C7" w:sz="1"/>
-              <w:left w:val="single" w:color="BDC3C7" w:sz="1"/>
-              <w:bottom w:val="single" w:color="BDC3C7" w:sz="1"/>
-              <w:right w:val="single" w:color="BDC3C7" w:sz="1"/>
-            </w:tcBorders>
-            <w:tcMar>
-              <w:top w:type="dxa" w:w="80"/>
-              <w:left w:type="dxa" w:w="120"/>
-              <w:bottom w:type="dxa" w:w="80"/>
-              <w:right w:type="dxa" w:w="120"/>
-            </w:tcMar>
-          </w:tcPr>
-          <w:p>
-            <w:pPr>
-              <w:spacing w:after="0"/>
-              <w:jc w:val="center"/>
-            </w:pPr>
-            <w:r>
-              <w:rPr>
-                <w:rFonts w:ascii="Arial" w:cs="Arial" w:eastAsia="Arial" w:hAnsi="Arial"/>
-                <w:color w:val="2C3E50"/>
-                <w:sz w:val="20"/>
-                <w:szCs w:val="20"/>
-              </w:rPr>
-              <w:t xml:space="preserve">Medium</w:t>
-            </w:r>
-          </w:p>
-        </w:tc>
-        <w:tc>
-          <w:tcPr>
-            <w:tcW w:type="dxa" w:w="4460"/>
-            <w:tcBorders>
-              <w:top w:val="single" w:color="BDC3C7" w:sz="1"/>
-              <w:left w:val="single" w:color="BDC3C7" w:sz="1"/>
-              <w:bottom w:val="single" w:color="BDC3C7" w:sz="1"/>
-              <w:right w:val="single" w:color="BDC3C7" w:sz="1"/>
-            </w:tcBorders>
-            <w:tcMar>
-              <w:top w:type="dxa" w:w="80"/>
-              <w:left w:type="dxa" w:w="120"/>
-              <w:bottom w:type="dxa" w:w="80"/>
-              <w:right w:type="dxa" w:w="120"/>
-            </w:tcMar>
-          </w:tcPr>
-          <w:p>
-            <w:pPr>
-              <w:spacing w:after="0"/>
-              <w:jc w:val="center"/>
-            </w:pPr>
-            <w:r>
-              <w:rPr>
-                <w:rFonts w:ascii="Arial" w:cs="Arial" w:eastAsia="Arial" w:hAnsi="Arial"/>
-                <w:color w:val="2C3E50"/>
-                <w:sz w:val="20"/>
-                <w:szCs w:val="20"/>
-              </w:rPr>
-              <w:t xml:space="preserve">43 KB/min memory leak during AI inference</w:t>
-            </w:r>
-          </w:p>
-        </w:tc>
-      </w:tr>
-      <w:tr>
-        <w:tc>
-          <w:tcPr>
-            <w:tcW w:type="dxa" w:w="3100"/>
-            <w:tcBorders>
-              <w:top w:val="single" w:color="BDC3C7" w:sz="1"/>
-              <w:left w:val="single" w:color="BDC3C7" w:sz="1"/>
-              <w:bottom w:val="single" w:color="BDC3C7" w:sz="1"/>
-              <w:right w:val="single" w:color="BDC3C7" w:sz="1"/>
-            </w:tcBorders>
-            <w:shd w:fill="F2F3F4" w:val="clear"/>
-            <w:tcMar>
-              <w:top w:type="dxa" w:w="80"/>
-              <w:left w:type="dxa" w:w="120"/>
-              <w:bottom w:type="dxa" w:w="80"/>
-              <w:right w:type="dxa" w:w="120"/>
-            </w:tcMar>
-          </w:tcPr>
-          <w:p>
-            <w:pPr>
-              <w:spacing w:after="0"/>
-              <w:jc w:val="left"/>
-            </w:pPr>
-            <w:r>
-              <w:rPr>
-                <w:rFonts w:ascii="Arial" w:cs="Arial" w:eastAsia="Arial" w:hAnsi="Arial"/>
-                <w:color w:val="2C3E50"/>
-                <w:sz w:val="20"/>
-                <w:szCs w:val="20"/>
-              </w:rPr>
-              <w:t xml:space="preserve">Container.tint doesn’t exist in PixiJS v8</w:t>
-            </w:r>
-          </w:p>
-        </w:tc>
-        <w:tc>
-          <w:tcPr>
-            <w:tcW w:type="dxa" w:w="1800"/>
-            <w:tcBorders>
-              <w:top w:val="single" w:color="BDC3C7" w:sz="1"/>
-              <w:left w:val="single" w:color="BDC3C7" w:sz="1"/>
-              <w:bottom w:val="single" w:color="BDC3C7" w:sz="1"/>
-              <w:right w:val="single" w:color="BDC3C7" w:sz="1"/>
-            </w:tcBorders>
-            <w:shd w:fill="F2F3F4" w:val="clear"/>
-            <w:tcMar>
-              <w:top w:type="dxa" w:w="80"/>
-              <w:left w:type="dxa" w:w="120"/>
-              <w:bottom w:type="dxa" w:w="80"/>
-              <w:right w:type="dxa" w:w="120"/>
-            </w:tcMar>
-          </w:tcPr>
-          <w:p>
-            <w:pPr>
-              <w:spacing w:after="0"/>
-              <w:jc w:val="center"/>
-            </w:pPr>
-            <w:r>
-              <w:rPr>
-                <w:rFonts w:ascii="Arial" w:cs="Arial" w:eastAsia="Arial" w:hAnsi="Arial"/>
-                <w:color w:val="2C3E50"/>
-                <w:sz w:val="20"/>
-                <w:szCs w:val="20"/>
-              </w:rPr>
-              <w:t xml:space="preserve">Medium</w:t>
-            </w:r>
-          </w:p>
-        </w:tc>
-        <w:tc>
-          <w:tcPr>
-            <w:tcW w:type="dxa" w:w="4460"/>
-            <w:tcBorders>
-              <w:top w:val="single" w:color="BDC3C7" w:sz="1"/>
-              <w:left w:val="single" w:color="BDC3C7" w:sz="1"/>
-              <w:bottom w:val="single" w:color="BDC3C7" w:sz="1"/>
-              <w:right w:val="single" w:color="BDC3C7" w:sz="1"/>
-            </w:tcBorders>
-            <w:shd w:fill="F2F3F4" w:val="clear"/>
-            <w:tcMar>
-              <w:top w:type="dxa" w:w="80"/>
-              <w:left w:type="dxa" w:w="120"/>
-              <w:bottom w:type="dxa" w:w="80"/>
-              <w:right w:type="dxa" w:w="120"/>
-            </w:tcMar>
-          </w:tcPr>
-          <w:p>
-            <w:pPr>
-              <w:spacing w:after="0"/>
-              <w:jc w:val="center"/>
-            </w:pPr>
-            <w:r>
-              <w:rPr>
-                <w:rFonts w:ascii="Arial" w:cs="Arial" w:eastAsia="Arial" w:hAnsi="Arial"/>
-                <w:color w:val="2C3E50"/>
-                <w:sz w:val="20"/>
-                <w:szCs w:val="20"/>
-              </w:rPr>
-              <w:t xml:space="preserve">AI car tint silently ignored—no visual distinction</w:t>
-            </w:r>
-          </w:p>
-        </w:tc>
-      </w:tr>
-      <w:tr>
-        <w:tc>
-          <w:tcPr>
-            <w:tcW w:type="dxa" w:w="3100"/>
-            <w:tcBorders>
-              <w:top w:val="single" w:color="BDC3C7" w:sz="1"/>
-              <w:left w:val="single" w:color="BDC3C7" w:sz="1"/>
-              <w:bottom w:val="single" w:color="BDC3C7" w:sz="1"/>
-              <w:right w:val="single" w:color="BDC3C7" w:sz="1"/>
-            </w:tcBorders>
-            <w:tcMar>
-              <w:top w:type="dxa" w:w="80"/>
-              <w:left w:type="dxa" w:w="120"/>
-              <w:bottom w:type="dxa" w:w="80"/>
-              <w:right w:type="dxa" w:w="120"/>
-            </w:tcMar>
-          </w:tcPr>
-          <w:p>
-            <w:pPr>
-              <w:spacing w:after="0"/>
-              <w:jc w:val="left"/>
-            </w:pPr>
-            <w:r>
-              <w:rPr>
-                <w:rFonts w:ascii="Arial" w:cs="Arial" w:eastAsia="Arial" w:hAnsi="Arial"/>
-                <w:color w:val="2C3E50"/>
-                <w:sz w:val="20"/>
-                <w:szCs w:val="20"/>
-              </w:rPr>
-              <w:t xml:space="preserve">Grace countdown ticks during pause</w:t>
-            </w:r>
-          </w:p>
-        </w:tc>
-        <w:tc>
-          <w:tcPr>
-            <w:tcW w:type="dxa" w:w="1800"/>
-            <w:tcBorders>
-              <w:top w:val="single" w:color="BDC3C7" w:sz="1"/>
-              <w:left w:val="single" w:color="BDC3C7" w:sz="1"/>
-              <w:bottom w:val="single" w:color="BDC3C7" w:sz="1"/>
-              <w:right w:val="single" w:color="BDC3C7" w:sz="1"/>
-            </w:tcBorders>
-            <w:tcMar>
-              <w:top w:type="dxa" w:w="80"/>
-              <w:left w:type="dxa" w:w="120"/>
-              <w:bottom w:type="dxa" w:w="80"/>
-              <w:right w:type="dxa" w:w="120"/>
-            </w:tcMar>
-          </w:tcPr>
-          <w:p>
-            <w:pPr>
-              <w:spacing w:after="0"/>
-              <w:jc w:val="center"/>
-            </w:pPr>
-            <w:r>
-              <w:rPr>
-                <w:rFonts w:ascii="Arial" w:cs="Arial" w:eastAsia="Arial" w:hAnsi="Arial"/>
-                <w:color w:val="2C3E50"/>
-                <w:sz w:val="20"/>
-                <w:szCs w:val="20"/>
-              </w:rPr>
-              <w:t xml:space="preserve">High</w:t>
-            </w:r>
-          </w:p>
-        </w:tc>
-        <w:tc>
-          <w:tcPr>
-            <w:tcW w:type="dxa" w:w="4460"/>
-            <w:tcBorders>
-              <w:top w:val="single" w:color="BDC3C7" w:sz="1"/>
-              <w:left w:val="single" w:color="BDC3C7" w:sz="1"/>
-              <w:bottom w:val="single" w:color="BDC3C7" w:sz="1"/>
-              <w:right w:val="single" w:color="BDC3C7" w:sz="1"/>
-            </w:tcBorders>
-            <w:tcMar>
-              <w:top w:type="dxa" w:w="80"/>
-              <w:left w:type="dxa" w:w="120"/>
-              <w:bottom w:type="dxa" w:w="80"/>
-              <w:right w:type="dxa" w:w="120"/>
-            </w:tcMar>
-          </w:tcPr>
-          <w:p>
-            <w:pPr>
-              <w:spacing w:after="0"/>
-              <w:jc w:val="center"/>
-            </w:pPr>
-            <w:r>
-              <w:rPr>
-                <w:rFonts w:ascii="Arial" w:cs="Arial" w:eastAsia="Arial" w:hAnsi="Arial"/>
-                <w:color w:val="2C3E50"/>
-                <w:sz w:val="20"/>
-                <w:szCs w:val="20"/>
-              </w:rPr>
-              <w:t xml:space="preserve">Player’s 5-second window consumed while game is paused</w:t>
-            </w:r>
-          </w:p>
-        </w:tc>
-      </w:tr>
-      <w:tr>
-        <w:tc>
-          <w:tcPr>
-            <w:tcW w:type="dxa" w:w="3100"/>
-            <w:tcBorders>
-              <w:top w:val="single" w:color="BDC3C7" w:sz="1"/>
-              <w:left w:val="single" w:color="BDC3C7" w:sz="1"/>
-              <w:bottom w:val="single" w:color="BDC3C7" w:sz="1"/>
-              <w:right w:val="single" w:color="BDC3C7" w:sz="1"/>
-            </w:tcBorders>
-            <w:shd w:fill="F2F3F4" w:val="clear"/>
-            <w:tcMar>
-              <w:top w:type="dxa" w:w="80"/>
-              <w:left w:type="dxa" w:w="120"/>
-              <w:bottom w:type="dxa" w:w="80"/>
-              <w:right w:type="dxa" w:w="120"/>
-            </w:tcMar>
-          </w:tcPr>
-          <w:p>
-            <w:pPr>
-              <w:spacing w:after="0"/>
-              <w:jc w:val="left"/>
-            </w:pPr>
-            <w:r>
-              <w:rPr>
-                <w:rFonts w:ascii="Arial" w:cs="Arial" w:eastAsia="Arial" w:hAnsi="Arial"/>
-                <w:color w:val="2C3E50"/>
-                <w:sz w:val="20"/>
-                <w:szCs w:val="20"/>
-              </w:rPr>
-              <w:t xml:space="preserve">record() vs record_mean() in TensorBoard</w:t>
-            </w:r>
-          </w:p>
-        </w:tc>
-        <w:tc>
-          <w:tcPr>
-            <w:tcW w:type="dxa" w:w="1800"/>
-            <w:tcBorders>
-              <w:top w:val="single" w:color="BDC3C7" w:sz="1"/>
-              <w:left w:val="single" w:color="BDC3C7" w:sz="1"/>
-              <w:bottom w:val="single" w:color="BDC3C7" w:sz="1"/>
-              <w:right w:val="single" w:color="BDC3C7" w:sz="1"/>
-            </w:tcBorders>
-            <w:shd w:fill="F2F3F4" w:val="clear"/>
-            <w:tcMar>
-              <w:top w:type="dxa" w:w="80"/>
-              <w:left w:type="dxa" w:w="120"/>
-              <w:bottom w:type="dxa" w:w="80"/>
-              <w:right w:type="dxa" w:w="120"/>
-            </w:tcMar>
-          </w:tcPr>
-          <w:p>
-            <w:pPr>
-              <w:spacing w:after="0"/>
-              <w:jc w:val="center"/>
-            </w:pPr>
-            <w:r>
-              <w:rPr>
-                <w:rFonts w:ascii="Arial" w:cs="Arial" w:eastAsia="Arial" w:hAnsi="Arial"/>
-                <w:color w:val="2C3E50"/>
-                <w:sz w:val="20"/>
-                <w:szCs w:val="20"/>
-              </w:rPr>
-              <w:t xml:space="preserve">Medium</w:t>
-            </w:r>
-          </w:p>
-        </w:tc>
-        <w:tc>
-          <w:tcPr>
-            <w:tcW w:type="dxa" w:w="4460"/>
-            <w:tcBorders>
-              <w:top w:val="single" w:color="BDC3C7" w:sz="1"/>
-              <w:left w:val="single" w:color="BDC3C7" w:sz="1"/>
-              <w:bottom w:val="single" w:color="BDC3C7" w:sz="1"/>
-              <w:right w:val="single" w:color="BDC3C7" w:sz="1"/>
-            </w:tcBorders>
-            <w:shd w:fill="F2F3F4" w:val="clear"/>
-            <w:tcMar>
-              <w:top w:type="dxa" w:w="80"/>
-              <w:left w:type="dxa" w:w="120"/>
-              <w:bottom w:type="dxa" w:w="80"/>
-              <w:right w:type="dxa" w:w="120"/>
-            </w:tcMar>
-          </w:tcPr>
-          <w:p>
-            <w:pPr>
-              <w:spacing w:after="0"/>
-              <w:jc w:val="center"/>
-            </w:pPr>
-            <w:r>
-              <w:rPr>
-                <w:rFonts w:ascii="Arial" w:cs="Arial" w:eastAsia="Arial" w:hAnsi="Arial"/>
-                <w:color w:val="2C3E50"/>
-                <w:sz w:val="20"/>
-                <w:szCs w:val="20"/>
-              </w:rPr>
-              <w:t xml:space="preserve">Silent data corruption in training metrics</w:t>
-            </w:r>
-          </w:p>
-        </w:tc>
-      </w:tr>
-      <w:tr>
-        <w:tc>
-          <w:tcPr>
-            <w:tcW w:type="dxa" w:w="3100"/>
-            <w:tcBorders>
-              <w:top w:val="single" w:color="BDC3C7" w:sz="1"/>
-              <w:left w:val="single" w:color="BDC3C7" w:sz="1"/>
-              <w:bottom w:val="single" w:color="BDC3C7" w:sz="1"/>
-              <w:right w:val="single" w:color="BDC3C7" w:sz="1"/>
-            </w:tcBorders>
-            <w:tcMar>
-              <w:top w:type="dxa" w:w="80"/>
-              <w:left w:type="dxa" w:w="120"/>
-              <w:bottom w:type="dxa" w:w="80"/>
-              <w:right w:type="dxa" w:w="120"/>
-            </w:tcMar>
-          </w:tcPr>
-          <w:p>
-            <w:pPr>
-              <w:spacing w:after="0"/>
-              <w:jc w:val="left"/>
-            </w:pPr>
-            <w:r>
-              <w:rPr>
-                <w:rFonts w:ascii="Arial" w:cs="Arial" w:eastAsia="Arial" w:hAnsi="Arial"/>
-                <w:color w:val="2C3E50"/>
-                <w:sz w:val="20"/>
-                <w:szCs w:val="20"/>
-              </w:rPr>
-              <w:t xml:space="preserve">pickle.load() security risk (CWE-502)</w:t>
-            </w:r>
-          </w:p>
-        </w:tc>
-        <w:tc>
-          <w:tcPr>
-            <w:tcW w:type="dxa" w:w="1800"/>
-            <w:tcBorders>
-              <w:top w:val="single" w:color="BDC3C7" w:sz="1"/>
-              <w:left w:val="single" w:color="BDC3C7" w:sz="1"/>
-              <w:bottom w:val="single" w:color="BDC3C7" w:sz="1"/>
-              <w:right w:val="single" w:color="BDC3C7" w:sz="1"/>
-            </w:tcBorders>
-            <w:tcMar>
-              <w:top w:type="dxa" w:w="80"/>
-              <w:left w:type="dxa" w:w="120"/>
-              <w:bottom w:type="dxa" w:w="80"/>
-              <w:right w:type="dxa" w:w="120"/>
-            </w:tcMar>
-          </w:tcPr>
-          <w:p>
-            <w:pPr>
-              <w:spacing w:after="0"/>
-              <w:jc w:val="center"/>
-            </w:pPr>
-            <w:r>
-              <w:rPr>
-                <w:rFonts w:ascii="Arial" w:cs="Arial" w:eastAsia="Arial" w:hAnsi="Arial"/>
-                <w:color w:val="2C3E50"/>
-                <w:sz w:val="20"/>
-                <w:szCs w:val="20"/>
-              </w:rPr>
-              <w:t xml:space="preserve">Medium</w:t>
-            </w:r>
-          </w:p>
-        </w:tc>
-        <w:tc>
-          <w:tcPr>
-            <w:tcW w:type="dxa" w:w="4460"/>
-            <w:tcBorders>
-              <w:top w:val="single" w:color="BDC3C7" w:sz="1"/>
-              <w:left w:val="single" w:color="BDC3C7" w:sz="1"/>
-              <w:bottom w:val="single" w:color="BDC3C7" w:sz="1"/>
-              <w:right w:val="single" w:color="BDC3C7" w:sz="1"/>
-            </w:tcBorders>
-            <w:tcMar>
-              <w:top w:type="dxa" w:w="80"/>
-              <w:left w:type="dxa" w:w="120"/>
-              <w:bottom w:type="dxa" w:w="80"/>
-              <w:right w:type="dxa" w:w="120"/>
-            </w:tcMar>
-          </w:tcPr>
-          <w:p>
-            <w:pPr>
-              <w:spacing w:after="0"/>
-              <w:jc w:val="center"/>
-            </w:pPr>
-            <w:r>
-              <w:rPr>
-                <w:rFonts w:ascii="Arial" w:cs="Arial" w:eastAsia="Arial" w:hAnsi="Arial"/>
-                <w:color w:val="2C3E50"/>
-                <w:sz w:val="20"/>
-                <w:szCs w:val="20"/>
-              </w:rPr>
-              <w:t xml:space="preserve">Arbitrary code execution via malicious model file</w:t>
-            </w:r>
-          </w:p>
-        </w:tc>
-      </w:tr>
-      <w:tr>
-        <w:tc>
-          <w:tcPr>
-            <w:tcW w:type="dxa" w:w="3100"/>
-            <w:tcBorders>
-              <w:top w:val="single" w:color="BDC3C7" w:sz="1"/>
-              <w:left w:val="single" w:color="BDC3C7" w:sz="1"/>
-              <w:bottom w:val="single" w:color="BDC3C7" w:sz="1"/>
-              <w:right w:val="single" w:color="BDC3C7" w:sz="1"/>
-            </w:tcBorders>
-            <w:shd w:fill="F2F3F4" w:val="clear"/>
-            <w:tcMar>
-              <w:top w:type="dxa" w:w="80"/>
-              <w:left w:type="dxa" w:w="120"/>
-              <w:bottom w:type="dxa" w:w="80"/>
-              <w:right w:type="dxa" w:w="120"/>
-            </w:tcMar>
-          </w:tcPr>
-          <w:p>
-            <w:pPr>
-              <w:spacing w:after="0"/>
-              <w:jc w:val="left"/>
-            </w:pPr>
-            <w:r>
-              <w:rPr>
-                <w:rFonts w:ascii="Arial" w:cs="Arial" w:eastAsia="Arial" w:hAnsi="Arial"/>
-                <w:color w:val="2C3E50"/>
-                <w:sz w:val="20"/>
-                <w:szCs w:val="20"/>
-              </w:rPr>
-              <w:t xml:space="preserve">Multi-lap checkpoint key corruption</w:t>
-            </w:r>
-          </w:p>
-        </w:tc>
-        <w:tc>
-          <w:tcPr>
-            <w:tcW w:type="dxa" w:w="1800"/>
-            <w:tcBorders>
-              <w:top w:val="single" w:color="BDC3C7" w:sz="1"/>
-              <w:left w:val="single" w:color="BDC3C7" w:sz="1"/>
-              <w:bottom w:val="single" w:color="BDC3C7" w:sz="1"/>
-              <w:right w:val="single" w:color="BDC3C7" w:sz="1"/>
-            </w:tcBorders>
-            <w:shd w:fill="F2F3F4" w:val="clear"/>
-            <w:tcMar>
-              <w:top w:type="dxa" w:w="80"/>
-              <w:left w:type="dxa" w:w="120"/>
-              <w:bottom w:type="dxa" w:w="80"/>
-              <w:right w:type="dxa" w:w="120"/>
-            </w:tcMar>
-          </w:tcPr>
-          <w:p>
-            <w:pPr>
-              <w:spacing w:after="0"/>
-              <w:jc w:val="center"/>
-            </w:pPr>
-            <w:r>
-              <w:rPr>
-                <w:rFonts w:ascii="Arial" w:cs="Arial" w:eastAsia="Arial" w:hAnsi="Arial"/>
-                <w:color w:val="2C3E50"/>
-                <w:sz w:val="20"/>
-                <w:szCs w:val="20"/>
-              </w:rPr>
-              <w:t xml:space="preserve">High</w:t>
-            </w:r>
-          </w:p>
-        </w:tc>
-        <w:tc>
-          <w:tcPr>
-            <w:tcW w:type="dxa" w:w="4460"/>
-            <w:tcBorders>
-              <w:top w:val="single" w:color="BDC3C7" w:sz="1"/>
-              <w:left w:val="single" w:color="BDC3C7" w:sz="1"/>
-              <w:bottom w:val="single" w:color="BDC3C7" w:sz="1"/>
-              <w:right w:val="single" w:color="BDC3C7" w:sz="1"/>
-            </w:tcBorders>
-            <w:shd w:fill="F2F3F4" w:val="clear"/>
-            <w:tcMar>
-              <w:top w:type="dxa" w:w="80"/>
-              <w:left w:type="dxa" w:w="120"/>
-              <w:bottom w:type="dxa" w:w="80"/>
-              <w:right w:type="dxa" w:w="120"/>
-            </w:tcMar>
-          </w:tcPr>
-          <w:p>
-            <w:pPr>
-              <w:spacing w:after="0"/>
-              <w:jc w:val="center"/>
-            </w:pPr>
-            <w:r>
-              <w:rPr>
-                <w:rFonts w:ascii="Arial" w:cs="Arial" w:eastAsia="Arial" w:hAnsi="Arial"/>
-                <w:color w:val="2C3E50"/>
-                <w:sz w:val="20"/>
-                <w:szCs w:val="20"/>
-              </w:rPr>
-              <w:t xml:space="preserve">Gap timer shows wildly incorrect values after lap 1</w:t>
-            </w:r>
-          </w:p>
-        </w:tc>
-      </w:tr>
-    </w:tbl>
-    <w:p>
-      <w:pPr>
-        <w:spacing w:after="0" w:before="100"/>
-      </w:pPr>
+        <w:spacing w:after="120" w:before="120"/>
+      </w:pPr>
+      <w:r>
+        <w:rPr>
+          <w:rFonts w:ascii="Arial" w:cs="Arial" w:eastAsia="Arial" w:hAnsi="Arial"/>
+          <w:i/>
+          <w:iCs/>
+          <w:color w:val="555555"/>
+          <w:sz w:val="22"/>
+          <w:szCs w:val="22"/>
+        </w:rPr>
+        <w:t xml:space="preserve">The full defect catalog with severity ratings, root cause analysis, and code-level descriptions is in Document 3: Testing &amp; Defect Prevention.</w:t>
+      </w:r>
+    </w:p>
+    <w:p>
+      <w:pPr>
+        <w:pBdr>
+          <w:bottom w:val="single" w:color="85C1E9" w:sz="3" w:space="1"/>
+        </w:pBdr>
+        <w:spacing w:after="300" w:before="300"/>
+      </w:pPr>
+    </w:p>
+    <w:p>
+      <w:pPr>
+        <w:pStyle w:val="Heading1"/>
+      </w:pPr>
+      <w:r>
+        <w:t xml:space="preserve">Architecture Integrity</w:t>
+      </w:r>
+    </w:p>
+    <w:p>
+      <w:pPr>
+        <w:spacing w:after="160" w:line="276"/>
+      </w:pPr>
+      <w:r>
+        <w:rPr>
+          <w:rFonts w:ascii="Arial" w:cs="Arial" w:eastAsia="Arial" w:hAnsi="Arial"/>
+          <w:color w:val="2C3E50"/>
+          <w:sz w:val="22"/>
+          <w:szCs w:val="22"/>
+        </w:rPr>
+        <w:t xml:space="preserve">The two-layer architecture—simulation engine completely decoupled from renderer—is the non-negotiable foundation of the project. If the boundary leaks, the simulation can’t run headless, and the AI training pipeline breaks.</w:t>
+      </w:r>
+    </w:p>
+    <w:p>
+      <w:pPr>
+        <w:spacing w:after="160" w:line="276"/>
+      </w:pPr>
+      <w:r>
+        <w:rPr>
+          <w:rFonts w:ascii="Arial" w:cs="Arial" w:eastAsia="Arial" w:hAnsi="Arial"/>
+          <w:color w:val="2C3E50"/>
+          <w:sz w:val="22"/>
+          <w:szCs w:val="22"/>
+        </w:rPr>
+        <w:t xml:space="preserve">This boundary was verified programmatically: all 9 engine source files import exclusively from within src/engine/. Zero cross-boundary imports. The renderer reads engine state through clean interfaces and never mutates game logic. The </w:t>
+      </w:r>
+      <w:r>
+        <w:rPr>
+          <w:rFonts w:ascii="Arial" w:cs="Arial" w:eastAsia="Arial" w:hAnsi="Arial"/>
+          <w:i/>
+          <w:iCs/>
+          <w:color w:val="2C3E50"/>
+          <w:sz w:val="22"/>
+          <w:szCs w:val="22"/>
+        </w:rPr>
+        <w:t xml:space="preserve">architecture-strategist</w:t>
+      </w:r>
+      <w:r>
+        <w:rPr>
+          <w:rFonts w:ascii="Arial" w:cs="Arial" w:eastAsia="Arial" w:hAnsi="Arial"/>
+          <w:color w:val="2C3E50"/>
+          <w:sz w:val="22"/>
+          <w:szCs w:val="22"/>
+        </w:rPr>
+        <w:t xml:space="preserve"> agent reviewed the boundary after every structural change.</w:t>
+      </w:r>
+    </w:p>
+    <w:p>
+      <w:pPr>
+        <w:spacing w:after="160" w:line="276"/>
+      </w:pPr>
+      <w:r>
+        <w:rPr>
+          <w:rFonts w:ascii="Arial" w:cs="Arial" w:eastAsia="Arial" w:hAnsi="Arial"/>
+          <w:color w:val="2C3E50"/>
+          <w:sz w:val="22"/>
+          <w:szCs w:val="22"/>
+        </w:rPr>
+        <w:t xml:space="preserve">When the architecture strategist found a violation—game state machine logic living in the renderer layer—it was extracted to the engine (ARCH-01) before Phase 3 began. The violation was caught by automated review, not manual inspection.</w:t>
+      </w:r>
     </w:p>
     <w:tbl>
       <w:tblPr>
@@ -3780,7 +2801,7 @@
                 <w:sz w:val="22"/>
                 <w:szCs w:val="22"/>
               </w:rPr>
-              <w:t xml:space="preserve">This is a sample—the full defect prevention evidence document catalogs every bug caught across all 15 deepening sessions, with severity ratings, root cause analysis, and the specific plan that identified each defect.</w:t>
+              <w:t xml:space="preserve">The accompanying Architecture Evidence document includes full dependency analysis, import boundary verification scripts, module coupling metrics, and the complete architecture decision record.</w:t>
             </w:r>
           </w:p>
         </w:tc>
@@ -3799,136 +2820,6 @@
         <w:pStyle w:val="Heading1"/>
       </w:pPr>
       <w:r>
-        <w:t xml:space="preserve">Architecture Integrity</w:t>
-      </w:r>
-    </w:p>
-    <w:p>
-      <w:pPr>
-        <w:spacing w:after="160" w:line="276"/>
-      </w:pPr>
-      <w:r>
-        <w:rPr>
-          <w:rFonts w:ascii="Arial" w:cs="Arial" w:eastAsia="Arial" w:hAnsi="Arial"/>
-          <w:color w:val="2C3E50"/>
-          <w:sz w:val="22"/>
-          <w:szCs w:val="22"/>
-        </w:rPr>
-        <w:t xml:space="preserve">The two-layer architecture—simulation engine completely decoupled from renderer—is the non-negotiable foundation of the project. If the boundary leaks, the simulation can’t run headless, and the AI training pipeline breaks.</w:t>
-      </w:r>
-    </w:p>
-    <w:p>
-      <w:pPr>
-        <w:spacing w:after="160" w:line="276"/>
-      </w:pPr>
-      <w:r>
-        <w:rPr>
-          <w:rFonts w:ascii="Arial" w:cs="Arial" w:eastAsia="Arial" w:hAnsi="Arial"/>
-          <w:color w:val="2C3E50"/>
-          <w:sz w:val="22"/>
-          <w:szCs w:val="22"/>
-        </w:rPr>
-        <w:t xml:space="preserve">This boundary was verified programmatically: all 9 engine source files import exclusively from within src/engine/. Zero cross-boundary imports. The renderer reads engine state through clean interfaces and never mutates game logic. The </w:t>
-      </w:r>
-      <w:r>
-        <w:rPr>
-          <w:rFonts w:ascii="Arial" w:cs="Arial" w:eastAsia="Arial" w:hAnsi="Arial"/>
-          <w:i/>
-          <w:iCs/>
-          <w:color w:val="2C3E50"/>
-          <w:sz w:val="22"/>
-          <w:szCs w:val="22"/>
-        </w:rPr>
-        <w:t xml:space="preserve">architecture-strategist</w:t>
-      </w:r>
-      <w:r>
-        <w:rPr>
-          <w:rFonts w:ascii="Arial" w:cs="Arial" w:eastAsia="Arial" w:hAnsi="Arial"/>
-          <w:color w:val="2C3E50"/>
-          <w:sz w:val="22"/>
-          <w:szCs w:val="22"/>
-        </w:rPr>
-        <w:t xml:space="preserve"> agent reviewed the boundary after every structural change.</w:t>
-      </w:r>
-    </w:p>
-    <w:p>
-      <w:pPr>
-        <w:spacing w:after="160" w:line="276"/>
-      </w:pPr>
-      <w:r>
-        <w:rPr>
-          <w:rFonts w:ascii="Arial" w:cs="Arial" w:eastAsia="Arial" w:hAnsi="Arial"/>
-          <w:color w:val="2C3E50"/>
-          <w:sz w:val="22"/>
-          <w:szCs w:val="22"/>
-        </w:rPr>
-        <w:t xml:space="preserve">When the architecture strategist found a violation—game state machine logic living in the renderer layer—it was extracted to the engine (ARCH-01) before Phase 3 began. The violation was caught by automated review, not manual inspection.</w:t>
-      </w:r>
-    </w:p>
-    <w:tbl>
-      <w:tblPr>
-        <w:tblW w:type="dxa" w:w="9360"/>
-        <w:tblBorders>
-          <w:top w:val="single" w:color="auto" w:sz="4"/>
-          <w:left w:val="single" w:color="auto" w:sz="4"/>
-          <w:bottom w:val="single" w:color="auto" w:sz="4"/>
-          <w:right w:val="single" w:color="auto" w:sz="4"/>
-          <w:insideH w:val="single" w:color="auto" w:sz="4"/>
-          <w:insideV w:val="single" w:color="auto" w:sz="4"/>
-        </w:tblBorders>
-      </w:tblPr>
-      <w:tblGrid>
-        <w:gridCol w:w="9360"/>
-      </w:tblGrid>
-      <w:tr>
-        <w:tc>
-          <w:tcPr>
-            <w:tcW w:type="dxa" w:w="9360"/>
-            <w:tcBorders>
-              <w:top w:val="single" w:color="85C1E9" w:sz="1"/>
-              <w:left w:val="single" w:color="1B4F72" w:sz="12"/>
-              <w:bottom w:val="single" w:color="85C1E9" w:sz="1"/>
-              <w:right w:val="single" w:color="85C1E9" w:sz="1"/>
-            </w:tcBorders>
-            <w:shd w:fill="D6EAF8" w:val="clear"/>
-            <w:tcMar>
-              <w:top w:type="dxa" w:w="120"/>
-              <w:left w:type="dxa" w:w="200"/>
-              <w:bottom w:type="dxa" w:w="120"/>
-              <w:right w:type="dxa" w:w="200"/>
-            </w:tcMar>
-          </w:tcPr>
-          <w:p>
-            <w:pPr>
-              <w:spacing w:after="0"/>
-            </w:pPr>
-            <w:r>
-              <w:rPr>
-                <w:rFonts w:ascii="Arial" w:cs="Arial" w:eastAsia="Arial" w:hAnsi="Arial"/>
-                <w:i/>
-                <w:iCs/>
-                <w:color w:val="1B4F72"/>
-                <w:sz w:val="22"/>
-                <w:szCs w:val="22"/>
-              </w:rPr>
-              <w:t xml:space="preserve">The accompanying Architecture Evidence document includes full dependency analysis, import boundary verification scripts, module coupling metrics, and the complete architecture decision record.</w:t>
-            </w:r>
-          </w:p>
-        </w:tc>
-      </w:tr>
-    </w:tbl>
-    <w:p>
-      <w:pPr>
-        <w:pBdr>
-          <w:bottom w:val="single" w:color="85C1E9" w:sz="3" w:space="1"/>
-        </w:pBdr>
-        <w:spacing w:after="300" w:before="300"/>
-      </w:pPr>
-    </w:p>
-    <w:p>
-      <w:pPr>
-        <w:pStyle w:val="Heading1"/>
-      </w:pPr>
-      <w:r>
         <w:t xml:space="preserve">Testing Rigor</w:t>
       </w:r>
     </w:p>
@@ -3954,7 +2845,7 @@
           <w:sz w:val="22"/>
           <w:szCs w:val="22"/>
         </w:rPr>
-        <w:t xml:space="preserve">366+ automated tests</w:t>
+        <w:t xml:space="preserve">389 automated tests</w:t>
       </w:r>
       <w:r>
         <w:rPr>
@@ -4464,7 +3355,7 @@
                 <w:sz w:val="20"/>
                 <w:szCs w:val="20"/>
               </w:rPr>
-              <w:t xml:space="preserve">366+</w:t>
+              <w:t xml:space="preserve">389</w:t>
             </w:r>
           </w:p>
         </w:tc>
@@ -4852,7 +3743,7 @@
         <w:pStyle w:val="Heading1"/>
       </w:pPr>
       <w:r>
-        <w:t xml:space="preserve">What This Proves</w:t>
+        <w:t xml:space="preserve">What This Proves: Best-in-Class SDLC</w:t>
       </w:r>
     </w:p>
     <w:p>
@@ -4866,7 +3757,7 @@
           <w:sz w:val="22"/>
           <w:szCs w:val="22"/>
         </w:rPr>
-        <w:t xml:space="preserve">Top-Down Racer v02 demonstrates that autonomous AI development can produce software with measurable quality indicators that meet or exceed what most human development teams achieve:</w:t>
+        <w:t xml:space="preserve">Top-Down Racer v02 demonstrates that autonomous AI SDLC can produce software with measurable quality indicators that meet or exceed what the best human development teams achieve—not just in code, but across the entire lifecycle:</w:t>
       </w:r>
     </w:p>
     <w:p>
@@ -4916,7 +3807,7 @@
           <w:sz w:val="22"/>
           <w:szCs w:val="22"/>
         </w:rPr>
-        <w:t xml:space="preserve">366+ tests written as part of development, not afterthoughts. Deterministic physics verified across 1,000,000 ticks. Every phase adds tests.</w:t>
+        <w:t xml:space="preserve">389 tests written as part of development, not afterthoughts. Deterministic physics verified across 1,000,000 ticks. Every phase adds tests.</w:t>
       </w:r>
     </w:p>
     <w:p>
@@ -4966,7 +3857,7 @@
           <w:sz w:val="22"/>
           <w:szCs w:val="22"/>
         </w:rPr>
-        <w:t xml:space="preserve">Reward function worked on first training run with no tuning. Architecture held clean across 6 phases and 80+ commits. The upfront design investment paid dividends throughout.</w:t>
+        <w:t xml:space="preserve">Reward function worked on first training run with no tuning. Architecture held clean across 6 phases and 189+ commits. The upfront design investment paid dividends throughout.</w:t>
       </w:r>
     </w:p>
     <w:p>
@@ -5045,7 +3936,7 @@
                 <w:sz w:val="22"/>
                 <w:szCs w:val="22"/>
               </w:rPr>
-              <w:t xml:space="preserve">The question is not whether AI can assist with writing code—that’s yesterday’s news. The question is whether AI can autonomously build production-quality software under human architectural direction, with the same rigor expected of professional development teams. This evidence package documents what autonomy looks like.</w:t>
+              <w:t xml:space="preserve">The question is not whether AI can assist with writing code—that’s yesterday’s news. The question is whether AI can autonomously execute the entire SDLC—specification, architecture, planning, code, testing, review, and deployment—at best-in-class quality. This evidence package proves it can.</w:t>
             </w:r>
           </w:p>
         </w:tc>
@@ -5064,7 +3955,7 @@
         <w:pStyle w:val="Heading1"/>
       </w:pPr>
       <w:r>
-        <w:t xml:space="preserve">Evidence Package Contents</w:t>
+        <w:t xml:space="preserve">The Receipts: Evidence Package</w:t>
       </w:r>
     </w:p>
     <w:p>
@@ -5078,7 +3969,7 @@
           <w:sz w:val="22"/>
           <w:szCs w:val="22"/>
         </w:rPr>
-        <w:t xml:space="preserve">This executive summary is Document 0 of a comprehensive evidence package. The accompanying documents provide the technical receipts:</w:t>
+        <w:t xml:space="preserve">This executive summary is Document 0 of a 7-document evidence package. Best-in-class SDLC demands best-in-class proof. The accompanying documents provide the technical receipts:</w:t>
       </w:r>
     </w:p>
     <w:tbl>
@@ -5497,7 +4388,7 @@
                 <w:sz w:val="20"/>
                 <w:szCs w:val="20"/>
               </w:rPr>
-              <w:t xml:space="preserve">63 requirements mapped to code files and test files</w:t>
+              <w:t xml:space="preserve">78 requirements traced to code files and test files, 100% coverage</w:t>
             </w:r>
           </w:p>
         </w:tc>

</xml_diff>